<commit_message>
Expand minimal visual corpus and rerun PNG comparisons
- Extend TestCorpusGenerator with additional 8.2.1 minimal docs:
  auto-fit table, footnotes, columns, watermark, rtl-text
- Add inline/floating image corpus docs (currently tracked as Word export gaps)
- Regenerate corpus assets under PanoramicData.Render.Test/test-assets
- Regenerate Word/PDFium reference PNGs for all exportable docs
- Update visual comparison test known-gap handling for missing image baselines
- Update thresholds and phase/current status documentation
- Verify VisualRegressionComparisonTests pass with expanded corpus
</commit_message>
<xml_diff>
--- a/PanoramicData.Render.Test/test-assets/docx/headers-and-footers.docx
+++ b/PanoramicData.Render.Test/test-assets/docx/headers-and-footers.docx
@@ -15,8 +15,8 @@
     <w:sectPr>
       <w:pgSz w:w="12240" w:h="15840"/>
       <w:pgMar w:top="1440" w:right="1440" w:bottom="1440" w:left="1440" w:header="720" w:footer="720"/>
-      <w:headerReference xmlns:r="http://schemas.openxmlformats.org/officeDocument/2006/relationships" w:type="default" r:id="Raeb0f730d5df4d55"/>
-      <w:footerReference xmlns:r="http://schemas.openxmlformats.org/officeDocument/2006/relationships" w:type="default" r:id="R59df3cc71a1940b3"/>
+      <w:headerReference xmlns:r="http://schemas.openxmlformats.org/officeDocument/2006/relationships" w:type="default" r:id="Red7625bb103249d8"/>
+      <w:footerReference xmlns:r="http://schemas.openxmlformats.org/officeDocument/2006/relationships" w:type="default" r:id="R716ab2a872934c51"/>
     </w:sectPr>
   </w:body>
 </w:document>

</xml_diff>

<commit_message>
Fix page-break pagination + establish test policy with issue tracking
</commit_message>
<xml_diff>
--- a/PanoramicData.Render.Test/test-assets/docx/headers-and-footers.docx
+++ b/PanoramicData.Render.Test/test-assets/docx/headers-and-footers.docx
@@ -15,8 +15,8 @@
     <w:sectPr>
       <w:pgSz w:w="12240" w:h="15840"/>
       <w:pgMar w:top="1440" w:right="1440" w:bottom="1440" w:left="1440" w:header="720" w:footer="720"/>
-      <w:headerReference xmlns:r="http://schemas.openxmlformats.org/officeDocument/2006/relationships" w:type="default" r:id="Red7625bb103249d8"/>
-      <w:footerReference xmlns:r="http://schemas.openxmlformats.org/officeDocument/2006/relationships" w:type="default" r:id="R716ab2a872934c51"/>
+      <w:headerReference xmlns:r="http://schemas.openxmlformats.org/officeDocument/2006/relationships" w:type="default" r:id="R248183385a85407f"/>
+      <w:footerReference xmlns:r="http://schemas.openxmlformats.org/officeDocument/2006/relationships" w:type="default" r:id="Rcd5886698a2f4360"/>
     </w:sectPr>
   </w:body>
 </w:document>

</xml_diff>